<commit_message>
Update Readme md and docx with updated workflow integration section.
</commit_message>
<xml_diff>
--- a/Small Cell Remediation Project/ReadMe.docx
+++ b/Small Cell Remediation Project/ReadMe.docx
@@ -132,36 +132,12 @@
     </w:p>
     <w:p>
       <w:r>
-        <w:t xml:space="preserve">All ICD-10 diagnosis and procedure codes are loaded from the ICD-10 hierarchy </w:t>
-      </w:r>
-      <w:proofErr w:type="gramStart"/>
-      <w:r>
-        <w:t>table (##</w:t>
-      </w:r>
-      <w:proofErr w:type="gramEnd"/>
-      <w:r>
-        <w:t>ICD10_HIERARCHY).</w:t>
-      </w:r>
-    </w:p>
-    <w:p>
-      <w:r>
-        <w:t xml:space="preserve">Patient counts are </w:t>
-      </w:r>
-      <w:proofErr w:type="gramStart"/>
-      <w:r>
-        <w:t>calculated per</w:t>
-      </w:r>
-      <w:proofErr w:type="gramEnd"/>
-      <w:r>
-        <w:t xml:space="preserve"> ICD-10 </w:t>
-      </w:r>
-      <w:proofErr w:type="gramStart"/>
-      <w:r>
-        <w:t>code (##</w:t>
-      </w:r>
-      <w:proofErr w:type="gramEnd"/>
-      <w:r>
-        <w:t>DiagnosisRecode).</w:t>
+        <w:t>All ICD-10 diagnosis and procedure codes are loaded from the ICD-10 hierarchy table (##ICD10_HIERARCHY).</w:t>
+      </w:r>
+    </w:p>
+    <w:p>
+      <w:r>
+        <w:t>Patient counts are calculated per ICD-10 code (##DiagnosisRecode).</w:t>
       </w:r>
     </w:p>
     <w:p>
@@ -202,30 +178,825 @@
     </w:p>
     <w:p>
       <w:r>
-        <w:t xml:space="preserve">This table can be used </w:t>
+        <w:t>This table can be used to:</w:t>
+      </w:r>
+    </w:p>
+    <w:p>
+      <w:r>
+        <w:t>Build views</w:t>
+      </w:r>
+    </w:p>
+    <w:p>
+      <w:r>
+        <w:t>Create stored procedures</w:t>
+      </w:r>
+    </w:p>
+    <w:p>
+      <w:r>
+        <w:t>Integrate directly into analytic queries</w:t>
+      </w:r>
+    </w:p>
+    <w:p>
+      <w:r>
+        <w:t>________________________________________</w:t>
+      </w:r>
+    </w:p>
+    <w:p>
+      <w:pPr>
+        <w:rPr>
+          <w:b/>
+          <w:bCs/>
+        </w:rPr>
+      </w:pPr>
+      <w:r>
+        <w:rPr>
+          <w:b/>
+          <w:bCs/>
+        </w:rPr>
+        <w:t>2. Insurance / Beneficiary Data</w:t>
+      </w:r>
+    </w:p>
+    <w:p>
+      <w:r>
+        <w:t>Methodology</w:t>
+      </w:r>
+    </w:p>
+    <w:p>
+      <w:r>
+        <w:t>Patient counts are calculated by financial category / beneficiary.</w:t>
+      </w:r>
+    </w:p>
+    <w:p>
+      <w:r>
+        <w:t>If a beneficiary has &lt; 10 patients, the data is generalized by extracting the provider instead.</w:t>
+      </w:r>
+    </w:p>
+    <w:p>
+      <w:r>
+        <w:t>Output</w:t>
+      </w:r>
+    </w:p>
+    <w:p>
+      <w:r>
+        <w:t>A table suitable for use in views, stored procedures, or downstream analytic logic</w:t>
+      </w:r>
+    </w:p>
+    <w:p>
+      <w:r>
+        <w:t>________________________________________</w:t>
+      </w:r>
+    </w:p>
+    <w:p>
+      <w:pPr>
+        <w:rPr>
+          <w:b/>
+          <w:bCs/>
+        </w:rPr>
+      </w:pPr>
+      <w:r>
+        <w:rPr>
+          <w:b/>
+          <w:bCs/>
+        </w:rPr>
+        <w:t>3. Height &amp; Weight</w:t>
+      </w:r>
+    </w:p>
+    <w:p>
+      <w:r>
+        <w:t xml:space="preserve">Height and weight deidentification </w:t>
       </w:r>
       <w:proofErr w:type="gramStart"/>
       <w:r>
-        <w:t>to</w:t>
+        <w:t>uses</w:t>
       </w:r>
       <w:proofErr w:type="gramEnd"/>
       <w:r>
-        <w:t>:</w:t>
-      </w:r>
-    </w:p>
-    <w:p>
-      <w:r>
-        <w:t>Build views</w:t>
-      </w:r>
-    </w:p>
-    <w:p>
-      <w:r>
-        <w:t>Create stored procedures</w:t>
-      </w:r>
-    </w:p>
-    <w:p>
-      <w:r>
-        <w:t>Integrate directly into analytic queries</w:t>
+        <w:t xml:space="preserve"> last recorded measurement and applies categorical suppression for extreme values.</w:t>
+      </w:r>
+    </w:p>
+    <w:p>
+      <w:r>
+        <w:t>Male Patients</w:t>
+      </w:r>
+    </w:p>
+    <w:p>
+      <w:r>
+        <w:t>Height &gt; 84 inches → &gt;84</w:t>
+      </w:r>
+    </w:p>
+    <w:p>
+      <w:r>
+        <w:t>Weight &lt; 5 pounds → &lt;5</w:t>
+      </w:r>
+    </w:p>
+    <w:p>
+      <w:r>
+        <w:t>Weight &gt; 400 pounds → &gt;400</w:t>
+      </w:r>
+    </w:p>
+    <w:p>
+      <w:r>
+        <w:t>Female or Not Male Patients</w:t>
+      </w:r>
+    </w:p>
+    <w:p>
+      <w:r>
+        <w:t>Height &gt; 78 inches → &gt;78</w:t>
+      </w:r>
+    </w:p>
+    <w:p>
+      <w:r>
+        <w:t>Weight &lt; 5 pounds → &lt;5</w:t>
+      </w:r>
+    </w:p>
+    <w:p>
+      <w:r>
+        <w:t>Weight &gt; 350 pounds → &gt;350</w:t>
+      </w:r>
+    </w:p>
+    <w:p>
+      <w:pPr>
+        <w:spacing w:before="100" w:beforeAutospacing="1" w:after="100" w:afterAutospacing="1" w:line="240" w:lineRule="auto"/>
+        <w:outlineLvl w:val="1"/>
+        <w:rPr>
+          <w:rFonts w:eastAsia="Times New Roman" w:cs="Times New Roman"/>
+          <w:b/>
+          <w:bCs/>
+          <w:color w:val="212121"/>
+          <w:kern w:val="0"/>
+          <w14:ligatures w14:val="none"/>
+        </w:rPr>
+      </w:pPr>
+      <w:r>
+        <w:rPr>
+          <w:rFonts w:eastAsia="Times New Roman" w:cs="Times New Roman"/>
+          <w:b/>
+          <w:bCs/>
+          <w:color w:val="000000"/>
+          <w:kern w:val="0"/>
+          <w14:ligatures w14:val="none"/>
+        </w:rPr>
+        <w:lastRenderedPageBreak/>
+        <w:t>Workflow Integration and Delivery Process</w:t>
+      </w:r>
+    </w:p>
+    <w:p>
+      <w:pPr>
+        <w:spacing w:before="240" w:after="240" w:line="240" w:lineRule="auto"/>
+        <w:rPr>
+          <w:rFonts w:eastAsia="Times New Roman" w:cs="Times New Roman"/>
+          <w:color w:val="212121"/>
+          <w:kern w:val="0"/>
+          <w14:ligatures w14:val="none"/>
+        </w:rPr>
+      </w:pPr>
+      <w:r>
+        <w:rPr>
+          <w:rFonts w:eastAsia="Times New Roman" w:cs="Times New Roman"/>
+          <w:color w:val="000000"/>
+          <w:kern w:val="0"/>
+          <w14:ligatures w14:val="none"/>
+        </w:rPr>
+        <w:t>The deidentification logic is applied during the final stages of dataset development. Depending on the data domain, either the code itself or assets generated by the code are incorporated into the overall query.</w:t>
+      </w:r>
+    </w:p>
+    <w:p>
+      <w:pPr>
+        <w:spacing w:before="100" w:beforeAutospacing="1" w:after="100" w:afterAutospacing="1" w:line="240" w:lineRule="auto"/>
+        <w:outlineLvl w:val="2"/>
+        <w:rPr>
+          <w:rFonts w:eastAsia="Times New Roman" w:cs="Times New Roman"/>
+          <w:b/>
+          <w:bCs/>
+          <w:color w:val="212121"/>
+          <w:kern w:val="0"/>
+          <w14:ligatures w14:val="none"/>
+        </w:rPr>
+      </w:pPr>
+      <w:r>
+        <w:rPr>
+          <w:rFonts w:eastAsia="Times New Roman" w:cs="Times New Roman"/>
+          <w:b/>
+          <w:bCs/>
+          <w:color w:val="000000"/>
+          <w:kern w:val="0"/>
+          <w14:ligatures w14:val="none"/>
+        </w:rPr>
+        <w:t>Integration Approach</w:t>
+      </w:r>
+    </w:p>
+    <w:p>
+      <w:pPr>
+        <w:spacing w:before="240" w:after="240" w:line="240" w:lineRule="auto"/>
+        <w:rPr>
+          <w:rFonts w:eastAsia="Times New Roman" w:cs="Times New Roman"/>
+          <w:color w:val="212121"/>
+          <w:kern w:val="0"/>
+          <w14:ligatures w14:val="none"/>
+        </w:rPr>
+      </w:pPr>
+      <w:r>
+        <w:rPr>
+          <w:rFonts w:eastAsia="Times New Roman" w:cs="Times New Roman"/>
+          <w:color w:val="000000"/>
+          <w:kern w:val="0"/>
+          <w14:ligatures w14:val="none"/>
+        </w:rPr>
+        <w:t>The deidentification assets are integrated into the final dataset by joining on the original source value, such as:</w:t>
+      </w:r>
+    </w:p>
+    <w:p>
+      <w:pPr>
+        <w:numPr>
+          <w:ilvl w:val="0"/>
+          <w:numId w:val="3"/>
+        </w:numPr>
+        <w:spacing w:before="100" w:beforeAutospacing="1" w:after="100" w:afterAutospacing="1" w:line="240" w:lineRule="auto"/>
+        <w:ind w:left="648"/>
+        <w:rPr>
+          <w:rFonts w:eastAsia="Times New Roman" w:cs="Times New Roman"/>
+          <w:color w:val="000000"/>
+          <w:kern w:val="0"/>
+          <w14:ligatures w14:val="none"/>
+        </w:rPr>
+      </w:pPr>
+      <w:r>
+        <w:rPr>
+          <w:rFonts w:eastAsia="Times New Roman" w:cs="Times New Roman"/>
+          <w:color w:val="000000"/>
+          <w:kern w:val="0"/>
+          <w14:ligatures w14:val="none"/>
+        </w:rPr>
+        <w:t>ICD-10 diagnosis codes</w:t>
+      </w:r>
+    </w:p>
+    <w:p>
+      <w:pPr>
+        <w:numPr>
+          <w:ilvl w:val="0"/>
+          <w:numId w:val="3"/>
+        </w:numPr>
+        <w:spacing w:before="100" w:beforeAutospacing="1" w:after="100" w:afterAutospacing="1" w:line="240" w:lineRule="auto"/>
+        <w:ind w:left="648"/>
+        <w:rPr>
+          <w:rFonts w:eastAsia="Times New Roman" w:cs="Times New Roman"/>
+          <w:color w:val="000000"/>
+          <w:kern w:val="0"/>
+          <w14:ligatures w14:val="none"/>
+        </w:rPr>
+      </w:pPr>
+      <w:r>
+        <w:rPr>
+          <w:rFonts w:eastAsia="Times New Roman" w:cs="Times New Roman"/>
+          <w:color w:val="000000"/>
+          <w:kern w:val="0"/>
+          <w14:ligatures w14:val="none"/>
+        </w:rPr>
+        <w:t>ICD-10 procedure codes</w:t>
+      </w:r>
+    </w:p>
+    <w:p>
+      <w:pPr>
+        <w:numPr>
+          <w:ilvl w:val="0"/>
+          <w:numId w:val="3"/>
+        </w:numPr>
+        <w:spacing w:before="100" w:beforeAutospacing="1" w:after="100" w:afterAutospacing="1" w:line="240" w:lineRule="auto"/>
+        <w:ind w:left="648"/>
+        <w:rPr>
+          <w:rFonts w:eastAsia="Times New Roman" w:cs="Times New Roman"/>
+          <w:color w:val="000000"/>
+          <w:kern w:val="0"/>
+          <w14:ligatures w14:val="none"/>
+        </w:rPr>
+      </w:pPr>
+      <w:r>
+        <w:rPr>
+          <w:rFonts w:eastAsia="Times New Roman" w:cs="Times New Roman"/>
+          <w:color w:val="000000"/>
+          <w:kern w:val="0"/>
+          <w14:ligatures w14:val="none"/>
+        </w:rPr>
+        <w:t>CPT codes</w:t>
+      </w:r>
+    </w:p>
+    <w:p>
+      <w:pPr>
+        <w:numPr>
+          <w:ilvl w:val="0"/>
+          <w:numId w:val="3"/>
+        </w:numPr>
+        <w:spacing w:before="100" w:beforeAutospacing="1" w:after="100" w:afterAutospacing="1" w:line="240" w:lineRule="auto"/>
+        <w:ind w:left="648"/>
+        <w:rPr>
+          <w:rFonts w:eastAsia="Times New Roman" w:cs="Times New Roman"/>
+          <w:color w:val="000000"/>
+          <w:kern w:val="0"/>
+          <w14:ligatures w14:val="none"/>
+        </w:rPr>
+      </w:pPr>
+      <w:r>
+        <w:rPr>
+          <w:rFonts w:eastAsia="Times New Roman" w:cs="Times New Roman"/>
+          <w:color w:val="000000"/>
+          <w:kern w:val="0"/>
+          <w14:ligatures w14:val="none"/>
+        </w:rPr>
+        <w:t>Insurance or beneficiary names</w:t>
+      </w:r>
+    </w:p>
+    <w:p>
+      <w:pPr>
+        <w:spacing w:before="240" w:after="240" w:line="240" w:lineRule="auto"/>
+        <w:rPr>
+          <w:rFonts w:eastAsia="Times New Roman" w:cs="Times New Roman"/>
+          <w:color w:val="212121"/>
+          <w:kern w:val="0"/>
+          <w14:ligatures w14:val="none"/>
+        </w:rPr>
+      </w:pPr>
+      <w:r>
+        <w:rPr>
+          <w:rFonts w:eastAsia="Times New Roman" w:cs="Times New Roman"/>
+          <w:color w:val="000000"/>
+          <w:kern w:val="0"/>
+          <w14:ligatures w14:val="none"/>
+        </w:rPr>
+        <w:t>The original value is used to locate the corresponding deidentified value. The resulting dataset includes the deidentified field, typically identified by a column name containing the term </w:t>
+      </w:r>
+      <w:r>
+        <w:rPr>
+          <w:rFonts w:eastAsia="Times New Roman" w:cs="Times New Roman"/>
+          <w:b/>
+          <w:bCs/>
+          <w:color w:val="000000"/>
+          <w:kern w:val="0"/>
+          <w14:ligatures w14:val="none"/>
+        </w:rPr>
+        <w:t>"Recode"</w:t>
+      </w:r>
+      <w:r>
+        <w:rPr>
+          <w:rFonts w:eastAsia="Times New Roman" w:cs="Times New Roman"/>
+          <w:color w:val="000000"/>
+          <w:kern w:val="0"/>
+          <w14:ligatures w14:val="none"/>
+        </w:rPr>
+        <w:t>.</w:t>
+      </w:r>
+    </w:p>
+    <w:p>
+      <w:pPr>
+        <w:spacing w:before="100" w:beforeAutospacing="1" w:after="100" w:afterAutospacing="1" w:line="240" w:lineRule="auto"/>
+        <w:outlineLvl w:val="2"/>
+        <w:rPr>
+          <w:rFonts w:eastAsia="Times New Roman" w:cs="Times New Roman"/>
+          <w:b/>
+          <w:bCs/>
+          <w:color w:val="212121"/>
+          <w:kern w:val="0"/>
+          <w14:ligatures w14:val="none"/>
+        </w:rPr>
+      </w:pPr>
+      <w:r>
+        <w:rPr>
+          <w:rFonts w:eastAsia="Times New Roman" w:cs="Times New Roman"/>
+          <w:b/>
+          <w:bCs/>
+          <w:color w:val="000000"/>
+          <w:kern w:val="0"/>
+          <w14:ligatures w14:val="none"/>
+        </w:rPr>
+        <w:t>UC Davis Health Implementation</w:t>
+      </w:r>
+    </w:p>
+    <w:p>
+      <w:pPr>
+        <w:spacing w:before="240" w:after="240" w:line="240" w:lineRule="auto"/>
+        <w:rPr>
+          <w:rFonts w:eastAsia="Times New Roman" w:cs="Times New Roman"/>
+          <w:color w:val="212121"/>
+          <w:kern w:val="0"/>
+          <w14:ligatures w14:val="none"/>
+        </w:rPr>
+      </w:pPr>
+      <w:r>
+        <w:rPr>
+          <w:rFonts w:eastAsia="Times New Roman" w:cs="Times New Roman"/>
+          <w:color w:val="000000"/>
+          <w:kern w:val="0"/>
+          <w14:ligatures w14:val="none"/>
+        </w:rPr>
+        <w:t>UC Davis Health utilizes a mixed implementation approach:</w:t>
+      </w:r>
+    </w:p>
+    <w:p>
+      <w:pPr>
+        <w:numPr>
+          <w:ilvl w:val="0"/>
+          <w:numId w:val="4"/>
+        </w:numPr>
+        <w:spacing w:before="100" w:beforeAutospacing="1" w:after="100" w:afterAutospacing="1" w:line="240" w:lineRule="auto"/>
+        <w:ind w:left="648"/>
+        <w:rPr>
+          <w:rFonts w:eastAsia="Times New Roman" w:cs="Times New Roman"/>
+          <w:color w:val="000000"/>
+          <w:kern w:val="0"/>
+          <w14:ligatures w14:val="none"/>
+        </w:rPr>
+      </w:pPr>
+      <w:r>
+        <w:rPr>
+          <w:rFonts w:eastAsia="Times New Roman" w:cs="Times New Roman"/>
+          <w:b/>
+          <w:bCs/>
+          <w:color w:val="000000"/>
+          <w:kern w:val="0"/>
+          <w14:ligatures w14:val="none"/>
+        </w:rPr>
+        <w:t>Height and Weight:</w:t>
+      </w:r>
+      <w:r>
+        <w:rPr>
+          <w:rFonts w:eastAsia="Times New Roman" w:cs="Times New Roman"/>
+          <w:color w:val="000000"/>
+          <w:kern w:val="0"/>
+          <w14:ligatures w14:val="none"/>
+        </w:rPr>
+        <w:t> Deidentification logic is incorporated directly into the dataset query through SQL code snippets.</w:t>
+      </w:r>
+    </w:p>
+    <w:p>
+      <w:pPr>
+        <w:numPr>
+          <w:ilvl w:val="0"/>
+          <w:numId w:val="4"/>
+        </w:numPr>
+        <w:spacing w:before="100" w:beforeAutospacing="1" w:after="100" w:afterAutospacing="1" w:line="240" w:lineRule="auto"/>
+        <w:ind w:left="648"/>
+        <w:rPr>
+          <w:rFonts w:eastAsia="Times New Roman" w:cs="Times New Roman"/>
+          <w:color w:val="000000"/>
+          <w:kern w:val="0"/>
+          <w14:ligatures w14:val="none"/>
+        </w:rPr>
+      </w:pPr>
+      <w:r>
+        <w:rPr>
+          <w:rFonts w:eastAsia="Times New Roman" w:cs="Times New Roman"/>
+          <w:b/>
+          <w:bCs/>
+          <w:color w:val="000000"/>
+          <w:kern w:val="0"/>
+          <w14:ligatures w14:val="none"/>
+        </w:rPr>
+        <w:t>Diagnoses, Procedures, and Insurance Data:</w:t>
+      </w:r>
+      <w:r>
+        <w:rPr>
+          <w:rFonts w:eastAsia="Times New Roman" w:cs="Times New Roman"/>
+          <w:color w:val="000000"/>
+          <w:kern w:val="0"/>
+          <w14:ligatures w14:val="none"/>
+        </w:rPr>
+        <w:t> Deidentification logic is implemented through reusable database views that are joined to the primary query during dataset construction.</w:t>
+      </w:r>
+    </w:p>
+    <w:p>
+      <w:pPr>
+        <w:spacing w:before="240" w:after="240" w:line="240" w:lineRule="auto"/>
+        <w:rPr>
+          <w:rFonts w:eastAsia="Times New Roman" w:cs="Times New Roman"/>
+          <w:color w:val="212121"/>
+          <w:kern w:val="0"/>
+          <w14:ligatures w14:val="none"/>
+        </w:rPr>
+      </w:pPr>
+      <w:r>
+        <w:rPr>
+          <w:rFonts w:eastAsia="Times New Roman" w:cs="Times New Roman"/>
+          <w:color w:val="000000"/>
+          <w:kern w:val="0"/>
+          <w14:ligatures w14:val="none"/>
+        </w:rPr>
+        <w:t>This approach promotes consistency, reusability, and standardized application of privacy protections across projects.</w:t>
+      </w:r>
+    </w:p>
+    <w:p>
+      <w:pPr>
+        <w:spacing w:before="100" w:beforeAutospacing="1" w:after="100" w:afterAutospacing="1" w:line="240" w:lineRule="auto"/>
+        <w:outlineLvl w:val="2"/>
+        <w:rPr>
+          <w:rFonts w:eastAsia="Times New Roman" w:cs="Times New Roman"/>
+          <w:b/>
+          <w:bCs/>
+          <w:color w:val="212121"/>
+          <w:kern w:val="0"/>
+          <w14:ligatures w14:val="none"/>
+        </w:rPr>
+      </w:pPr>
+      <w:r>
+        <w:rPr>
+          <w:rFonts w:eastAsia="Times New Roman" w:cs="Times New Roman"/>
+          <w:b/>
+          <w:bCs/>
+          <w:color w:val="000000"/>
+          <w:kern w:val="0"/>
+          <w14:ligatures w14:val="none"/>
+        </w:rPr>
+        <w:t>Quality Assurance</w:t>
+      </w:r>
+    </w:p>
+    <w:p>
+      <w:pPr>
+        <w:spacing w:before="240" w:after="240" w:line="240" w:lineRule="auto"/>
+        <w:rPr>
+          <w:rFonts w:eastAsia="Times New Roman" w:cs="Times New Roman"/>
+          <w:color w:val="212121"/>
+          <w:kern w:val="0"/>
+          <w14:ligatures w14:val="none"/>
+        </w:rPr>
+      </w:pPr>
+      <w:r>
+        <w:rPr>
+          <w:rFonts w:eastAsia="Times New Roman" w:cs="Times New Roman"/>
+          <w:color w:val="000000"/>
+          <w:kern w:val="0"/>
+          <w14:ligatures w14:val="none"/>
+        </w:rPr>
+        <w:t>All datasets undergo a Quality Assurance (QA) review to verify that:</w:t>
+      </w:r>
+    </w:p>
+    <w:p>
+      <w:pPr>
+        <w:numPr>
+          <w:ilvl w:val="0"/>
+          <w:numId w:val="5"/>
+        </w:numPr>
+        <w:spacing w:before="100" w:beforeAutospacing="1" w:after="100" w:afterAutospacing="1" w:line="240" w:lineRule="auto"/>
+        <w:ind w:left="648"/>
+        <w:rPr>
+          <w:rFonts w:eastAsia="Times New Roman" w:cs="Times New Roman"/>
+          <w:color w:val="000000"/>
+          <w:kern w:val="0"/>
+          <w14:ligatures w14:val="none"/>
+        </w:rPr>
+      </w:pPr>
+      <w:r>
+        <w:rPr>
+          <w:rFonts w:eastAsia="Times New Roman" w:cs="Times New Roman"/>
+          <w:color w:val="000000"/>
+          <w:kern w:val="0"/>
+          <w14:ligatures w14:val="none"/>
+        </w:rPr>
+        <w:t>The appropriate deidentification logic was applied.</w:t>
+      </w:r>
+    </w:p>
+    <w:p>
+      <w:pPr>
+        <w:numPr>
+          <w:ilvl w:val="0"/>
+          <w:numId w:val="5"/>
+        </w:numPr>
+        <w:spacing w:before="100" w:beforeAutospacing="1" w:after="100" w:afterAutospacing="1" w:line="240" w:lineRule="auto"/>
+        <w:ind w:left="648"/>
+        <w:rPr>
+          <w:rFonts w:eastAsia="Times New Roman" w:cs="Times New Roman"/>
+          <w:color w:val="000000"/>
+          <w:kern w:val="0"/>
+          <w14:ligatures w14:val="none"/>
+        </w:rPr>
+      </w:pPr>
+      <w:r>
+        <w:rPr>
+          <w:rFonts w:eastAsia="Times New Roman" w:cs="Times New Roman"/>
+          <w:color w:val="000000"/>
+          <w:kern w:val="0"/>
+          <w14:ligatures w14:val="none"/>
+        </w:rPr>
+        <w:t>The correct deidentified columns were included in the output.</w:t>
+      </w:r>
+    </w:p>
+    <w:p>
+      <w:pPr>
+        <w:numPr>
+          <w:ilvl w:val="0"/>
+          <w:numId w:val="5"/>
+        </w:numPr>
+        <w:spacing w:before="100" w:beforeAutospacing="1" w:after="100" w:afterAutospacing="1" w:line="240" w:lineRule="auto"/>
+        <w:ind w:left="648"/>
+        <w:rPr>
+          <w:rFonts w:eastAsia="Times New Roman" w:cs="Times New Roman"/>
+          <w:color w:val="000000"/>
+          <w:kern w:val="0"/>
+          <w14:ligatures w14:val="none"/>
+        </w:rPr>
+      </w:pPr>
+      <w:r>
+        <w:rPr>
+          <w:rFonts w:eastAsia="Times New Roman" w:cs="Times New Roman"/>
+          <w:color w:val="000000"/>
+          <w:kern w:val="0"/>
+          <w14:ligatures w14:val="none"/>
+        </w:rPr>
+        <w:t>Required joins and transformations were implemented correctly.</w:t>
+      </w:r>
+    </w:p>
+    <w:p>
+      <w:pPr>
+        <w:numPr>
+          <w:ilvl w:val="0"/>
+          <w:numId w:val="5"/>
+        </w:numPr>
+        <w:spacing w:before="100" w:beforeAutospacing="1" w:after="100" w:afterAutospacing="1" w:line="240" w:lineRule="auto"/>
+        <w:ind w:left="648"/>
+        <w:rPr>
+          <w:rFonts w:eastAsia="Times New Roman" w:cs="Times New Roman"/>
+          <w:color w:val="000000"/>
+          <w:kern w:val="0"/>
+          <w14:ligatures w14:val="none"/>
+        </w:rPr>
+      </w:pPr>
+      <w:r>
+        <w:rPr>
+          <w:rFonts w:eastAsia="Times New Roman" w:cs="Times New Roman"/>
+          <w:color w:val="000000"/>
+          <w:kern w:val="0"/>
+          <w14:ligatures w14:val="none"/>
+        </w:rPr>
+        <w:t>Privacy thresholds and suppression rules were enforced as designed.</w:t>
+      </w:r>
+    </w:p>
+    <w:p>
+      <w:pPr>
+        <w:spacing w:before="100" w:beforeAutospacing="1" w:after="100" w:afterAutospacing="1" w:line="240" w:lineRule="auto"/>
+        <w:outlineLvl w:val="2"/>
+        <w:rPr>
+          <w:rFonts w:eastAsia="Times New Roman" w:cs="Times New Roman"/>
+          <w:b/>
+          <w:bCs/>
+          <w:color w:val="000000"/>
+          <w:kern w:val="0"/>
+          <w14:ligatures w14:val="none"/>
+        </w:rPr>
+      </w:pPr>
+    </w:p>
+    <w:p>
+      <w:pPr>
+        <w:spacing w:before="100" w:beforeAutospacing="1" w:after="100" w:afterAutospacing="1" w:line="240" w:lineRule="auto"/>
+        <w:outlineLvl w:val="2"/>
+        <w:rPr>
+          <w:rFonts w:eastAsia="Times New Roman" w:cs="Times New Roman"/>
+          <w:b/>
+          <w:bCs/>
+          <w:color w:val="212121"/>
+          <w:kern w:val="0"/>
+          <w14:ligatures w14:val="none"/>
+        </w:rPr>
+      </w:pPr>
+      <w:r>
+        <w:rPr>
+          <w:rFonts w:eastAsia="Times New Roman" w:cs="Times New Roman"/>
+          <w:b/>
+          <w:bCs/>
+          <w:color w:val="000000"/>
+          <w:kern w:val="0"/>
+          <w14:ligatures w14:val="none"/>
+        </w:rPr>
+        <w:lastRenderedPageBreak/>
+        <w:t>Researcher Communication</w:t>
+      </w:r>
+    </w:p>
+    <w:p>
+      <w:pPr>
+        <w:spacing w:before="240" w:after="240" w:line="240" w:lineRule="auto"/>
+        <w:rPr>
+          <w:rFonts w:eastAsia="Times New Roman" w:cs="Times New Roman"/>
+          <w:color w:val="212121"/>
+          <w:kern w:val="0"/>
+          <w14:ligatures w14:val="none"/>
+        </w:rPr>
+      </w:pPr>
+      <w:r>
+        <w:rPr>
+          <w:rFonts w:eastAsia="Times New Roman" w:cs="Times New Roman"/>
+          <w:color w:val="000000"/>
+          <w:kern w:val="0"/>
+          <w14:ligatures w14:val="none"/>
+        </w:rPr>
+        <w:t>Researchers are informed of all deidentification and data generalization methods used in their dataset.</w:t>
+      </w:r>
+    </w:p>
+    <w:p>
+      <w:pPr>
+        <w:spacing w:before="240" w:after="240" w:line="240" w:lineRule="auto"/>
+        <w:rPr>
+          <w:rFonts w:eastAsia="Times New Roman" w:cs="Times New Roman"/>
+          <w:color w:val="212121"/>
+          <w:kern w:val="0"/>
+          <w14:ligatures w14:val="none"/>
+        </w:rPr>
+      </w:pPr>
+      <w:r>
+        <w:rPr>
+          <w:rFonts w:eastAsia="Times New Roman" w:cs="Times New Roman"/>
+          <w:color w:val="000000"/>
+          <w:kern w:val="0"/>
+          <w14:ligatures w14:val="none"/>
+        </w:rPr>
+        <w:t>Communication occurs at two stages:</w:t>
+      </w:r>
+    </w:p>
+    <w:p>
+      <w:pPr>
+        <w:numPr>
+          <w:ilvl w:val="0"/>
+          <w:numId w:val="6"/>
+        </w:numPr>
+        <w:spacing w:before="100" w:beforeAutospacing="1" w:after="100" w:afterAutospacing="1" w:line="240" w:lineRule="auto"/>
+        <w:ind w:left="648"/>
+        <w:rPr>
+          <w:rFonts w:eastAsia="Times New Roman" w:cs="Times New Roman"/>
+          <w:color w:val="000000"/>
+          <w:kern w:val="0"/>
+          <w14:ligatures w14:val="none"/>
+        </w:rPr>
+      </w:pPr>
+      <w:r>
+        <w:rPr>
+          <w:rFonts w:eastAsia="Times New Roman" w:cs="Times New Roman"/>
+          <w:b/>
+          <w:bCs/>
+          <w:color w:val="000000"/>
+          <w:kern w:val="0"/>
+          <w14:ligatures w14:val="none"/>
+        </w:rPr>
+        <w:t>Project Planning Phase</w:t>
+      </w:r>
+      <w:r>
+        <w:rPr>
+          <w:rFonts w:eastAsia="Times New Roman" w:cs="Times New Roman"/>
+          <w:color w:val="000000"/>
+          <w:kern w:val="0"/>
+          <w14:ligatures w14:val="none"/>
+        </w:rPr>
+        <w:t> – Researchers are informed of any privacy-preserving transformations that may affect data granularity before query development begins.</w:t>
+      </w:r>
+    </w:p>
+    <w:p>
+      <w:pPr>
+        <w:numPr>
+          <w:ilvl w:val="0"/>
+          <w:numId w:val="6"/>
+        </w:numPr>
+        <w:spacing w:before="100" w:beforeAutospacing="1" w:after="100" w:afterAutospacing="1" w:line="240" w:lineRule="auto"/>
+        <w:ind w:left="648"/>
+        <w:rPr>
+          <w:rFonts w:eastAsia="Times New Roman" w:cs="Times New Roman"/>
+          <w:color w:val="000000"/>
+          <w:kern w:val="0"/>
+          <w14:ligatures w14:val="none"/>
+        </w:rPr>
+      </w:pPr>
+      <w:r>
+        <w:rPr>
+          <w:rFonts w:eastAsia="Times New Roman" w:cs="Times New Roman"/>
+          <w:b/>
+          <w:bCs/>
+          <w:color w:val="000000"/>
+          <w:kern w:val="0"/>
+          <w14:ligatures w14:val="none"/>
+        </w:rPr>
+        <w:t>Dataset Delivery Phase</w:t>
+      </w:r>
+      <w:r>
+        <w:rPr>
+          <w:rFonts w:eastAsia="Times New Roman" w:cs="Times New Roman"/>
+          <w:color w:val="000000"/>
+          <w:kern w:val="0"/>
+          <w14:ligatures w14:val="none"/>
+        </w:rPr>
+        <w:t> – Researchers receive documentation describing how the data was modified, generalized, or recoded prior to final delivery.</w:t>
+      </w:r>
+    </w:p>
+    <w:p>
+      <w:pPr>
+        <w:spacing w:before="240" w:after="240" w:line="240" w:lineRule="auto"/>
+        <w:rPr>
+          <w:rFonts w:eastAsia="Times New Roman" w:cs="Times New Roman"/>
+          <w:color w:val="212121"/>
+          <w:kern w:val="0"/>
+          <w14:ligatures w14:val="none"/>
+        </w:rPr>
+      </w:pPr>
+      <w:r>
+        <w:rPr>
+          <w:rFonts w:eastAsia="Times New Roman" w:cs="Times New Roman"/>
+          <w:color w:val="000000"/>
+          <w:kern w:val="0"/>
+          <w14:ligatures w14:val="none"/>
+        </w:rPr>
+        <w:t>This process ensures transparency regarding the impact of deidentification on the resulting dataset while maintaining compliance with privacy and regulatory requirements.</w:t>
       </w:r>
     </w:p>
     <w:p>
@@ -245,32 +1016,22 @@
           <w:b/>
           <w:bCs/>
         </w:rPr>
-        <w:t>2. Insurance / Beneficiary Data</w:t>
-      </w:r>
-    </w:p>
-    <w:p>
-      <w:r>
-        <w:t>Methodology</w:t>
-      </w:r>
-    </w:p>
-    <w:p>
-      <w:r>
-        <w:t>Patient counts are calculated by financial category / beneficiary.</w:t>
-      </w:r>
-    </w:p>
-    <w:p>
-      <w:r>
-        <w:t>If a beneficiary has &lt; 10 patients, the data is generalized by extracting the provider instead.</w:t>
-      </w:r>
-    </w:p>
-    <w:p>
-      <w:r>
-        <w:t>Output</w:t>
-      </w:r>
-    </w:p>
-    <w:p>
-      <w:r>
-        <w:t>A table suitable for use in views, stored procedures, or downstream analytic logic</w:t>
+        <w:t>Technology</w:t>
+      </w:r>
+    </w:p>
+    <w:p>
+      <w:r>
+        <w:t>Language: T-SQL</w:t>
+      </w:r>
+    </w:p>
+    <w:p>
+      <w:r>
+        <w:t>Database: SQL Server–compatible platforms</w:t>
+      </w:r>
+    </w:p>
+    <w:p>
+      <w:r>
+        <w:t>Although authored in T-SQL, the logic can be easily adapted to other programming languages or SQL dialects.</w:t>
       </w:r>
     </w:p>
     <w:p>
@@ -290,76 +1051,73 @@
           <w:b/>
           <w:bCs/>
         </w:rPr>
-        <w:t>3. Height &amp; Weight</w:t>
-      </w:r>
-    </w:p>
-    <w:p>
-      <w:r>
-        <w:t xml:space="preserve">Height and weight deidentification </w:t>
-      </w:r>
-      <w:proofErr w:type="gramStart"/>
-      <w:r>
-        <w:t>uses</w:t>
-      </w:r>
-      <w:proofErr w:type="gramEnd"/>
-      <w:r>
-        <w:t xml:space="preserve"> last recorded measurement and applies categorical suppression for extreme values.</w:t>
-      </w:r>
-    </w:p>
-    <w:p>
-      <w:r>
-        <w:t>Male Patients</w:t>
-      </w:r>
-    </w:p>
-    <w:p>
-      <w:r>
-        <w:t>Height &gt; 84 inches → &gt;84</w:t>
-      </w:r>
-    </w:p>
-    <w:p>
-      <w:r>
-        <w:t>Weight &lt; 5 pounds → &lt;5</w:t>
-      </w:r>
-    </w:p>
-    <w:p>
-      <w:r>
-        <w:t>Weight &gt; 400 pounds → &gt;400</w:t>
-      </w:r>
-    </w:p>
-    <w:p>
-      <w:r>
-        <w:t>Female or Not Male Patients</w:t>
-      </w:r>
-    </w:p>
-    <w:p>
-      <w:r>
-        <w:t>Height &gt; 78 inches → &gt;78</w:t>
-      </w:r>
-    </w:p>
-    <w:p>
-      <w:r>
-        <w:t>Weight &lt; 5 pounds → &lt;5</w:t>
-      </w:r>
-    </w:p>
-    <w:p>
-      <w:r>
-        <w:t>Weight &gt; 350 pounds → &gt;350</w:t>
+        <w:t>Intended Use</w:t>
+      </w:r>
+    </w:p>
+    <w:p>
+      <w:r>
+        <w:t>This code is intended for:</w:t>
+      </w:r>
+    </w:p>
+    <w:p>
+      <w:r>
+        <w:t>Deidentified research datasets</w:t>
+      </w:r>
+    </w:p>
+    <w:p>
+      <w:r>
+        <w:t>Regulatory-compliant analytics</w:t>
+      </w:r>
+    </w:p>
+    <w:p>
+      <w:r>
+        <w:t>IRB-approved data extracts</w:t>
+      </w:r>
+    </w:p>
+    <w:p>
+      <w:r>
+        <w:t>Population health and quality reporting</w:t>
+      </w:r>
+    </w:p>
+    <w:p>
+      <w:r>
+        <w:t>________________________________________</w:t>
+      </w:r>
+    </w:p>
+    <w:p>
+      <w:pPr>
+        <w:rPr>
+          <w:b/>
+          <w:bCs/>
+        </w:rPr>
+      </w:pPr>
+      <w:r>
+        <w:rPr>
+          <w:b/>
+          <w:bCs/>
+        </w:rPr>
+        <w:t>Privacy &amp; Compliance</w:t>
+      </w:r>
+    </w:p>
+    <w:p>
+      <w:r>
+        <w:t>All transformations were designed to align with:</w:t>
+      </w:r>
+    </w:p>
+    <w:p>
+      <w:r>
+        <w:t>HIPAA deidentification standards</w:t>
+      </w:r>
+    </w:p>
+    <w:p>
+      <w:r>
+        <w:t>UC Davis Health privacy requirements</w:t>
       </w:r>
     </w:p>
     <w:p>
       <w:r>
         <w:lastRenderedPageBreak/>
-        <w:t>Implementation Notes</w:t>
-      </w:r>
-    </w:p>
-    <w:p>
-      <w:r>
-        <w:t>Logic is implemented using CTEs</w:t>
-      </w:r>
-    </w:p>
-    <w:p>
-      <w:r>
-        <w:t>Output CTEs can be consumed in the same way as diagnosis and procedure rollups</w:t>
+        <w:t>IRB-approved data handling practices</w:t>
       </w:r>
     </w:p>
     <w:p>
@@ -379,142 +1137,12 @@
           <w:b/>
           <w:bCs/>
         </w:rPr>
-        <w:t>Technology</w:t>
-      </w:r>
-    </w:p>
-    <w:p>
-      <w:r>
-        <w:t>Language: T-SQL</w:t>
-      </w:r>
-    </w:p>
-    <w:p>
-      <w:r>
-        <w:t>Database: SQL Server–compatible platforms</w:t>
-      </w:r>
-    </w:p>
-    <w:p>
-      <w:r>
-        <w:t>Although authored in T-SQL, the logic can be easily adapted to other programming languages or SQL dialects.</w:t>
-      </w:r>
-    </w:p>
-    <w:p>
-      <w:r>
-        <w:t>________________________________________</w:t>
-      </w:r>
-    </w:p>
-    <w:p>
-      <w:pPr>
-        <w:rPr>
-          <w:b/>
-          <w:bCs/>
-        </w:rPr>
-      </w:pPr>
-      <w:r>
-        <w:rPr>
-          <w:b/>
-          <w:bCs/>
-        </w:rPr>
-        <w:t>Intended Use</w:t>
-      </w:r>
-    </w:p>
-    <w:p>
-      <w:r>
-        <w:t>This code is intended for:</w:t>
-      </w:r>
-    </w:p>
-    <w:p>
-      <w:r>
-        <w:t>Deidentified research datasets</w:t>
-      </w:r>
-    </w:p>
-    <w:p>
-      <w:r>
-        <w:t>Regulatory-compliant analytics</w:t>
-      </w:r>
-    </w:p>
-    <w:p>
-      <w:r>
-        <w:t>IRB-approved data extracts</w:t>
-      </w:r>
-    </w:p>
-    <w:p>
-      <w:r>
-        <w:t>Population health and quality reporting</w:t>
-      </w:r>
-    </w:p>
-    <w:p>
-      <w:r>
-        <w:t>________________________________________</w:t>
-      </w:r>
-    </w:p>
-    <w:p>
-      <w:pPr>
-        <w:rPr>
-          <w:b/>
-          <w:bCs/>
-        </w:rPr>
-      </w:pPr>
-      <w:r>
-        <w:rPr>
-          <w:b/>
-          <w:bCs/>
-        </w:rPr>
-        <w:t>Privacy &amp; Compliance</w:t>
-      </w:r>
-    </w:p>
-    <w:p>
-      <w:r>
-        <w:t>All transformations were designed to align with:</w:t>
-      </w:r>
-    </w:p>
-    <w:p>
-      <w:r>
-        <w:t>HIPAA deidentification standards</w:t>
-      </w:r>
-    </w:p>
-    <w:p>
-      <w:r>
-        <w:t>UC Davis Health privacy requirements</w:t>
-      </w:r>
-    </w:p>
-    <w:p>
-      <w:r>
-        <w:t>IRB-approved data handling practices</w:t>
-      </w:r>
-    </w:p>
-    <w:p>
-      <w:r>
-        <w:t>________________________________________</w:t>
-      </w:r>
-    </w:p>
-    <w:p>
-      <w:pPr>
-        <w:rPr>
-          <w:b/>
-          <w:bCs/>
-        </w:rPr>
-      </w:pPr>
-      <w:proofErr w:type="gramStart"/>
-      <w:r>
-        <w:rPr>
-          <w:b/>
-          <w:bCs/>
-        </w:rPr>
         <w:t>Contributing</w:t>
       </w:r>
-      <w:proofErr w:type="gramEnd"/>
-    </w:p>
-    <w:p>
-      <w:r>
-        <w:t xml:space="preserve">Enhancements, optimizations, or language adaptations are welcome. Please ensure that </w:t>
-      </w:r>
-      <w:proofErr w:type="gramStart"/>
-      <w:r>
-        <w:t>any</w:t>
-      </w:r>
-      <w:proofErr w:type="gramEnd"/>
-      <w:r>
-        <w:t xml:space="preserve"> changes:</w:t>
+    </w:p>
+    <w:p>
+      <w:r>
+        <w:t>Enhancements, optimizations, or language adaptations are welcome. Please ensure that any changes:</w:t>
       </w:r>
     </w:p>
     <w:p>
@@ -524,7 +1152,6 @@
     </w:p>
     <w:p>
       <w:r>
-        <w:lastRenderedPageBreak/>
         <w:t>Preserve reproducibility and auditability</w:t>
       </w:r>
     </w:p>
@@ -619,6 +1246,268 @@
 <file path=word/numbering.xml><?xml version="1.0" encoding="utf-8"?>
 <w:numbering xmlns:wpc="http://schemas.microsoft.com/office/word/2010/wordprocessingCanvas" xmlns:cx="http://schemas.microsoft.com/office/drawing/2014/chartex" xmlns:cx1="http://schemas.microsoft.com/office/drawing/2015/9/8/chartex" xmlns:cx2="http://schemas.microsoft.com/office/drawing/2015/10/21/chartex" xmlns:cx3="http://schemas.microsoft.com/office/drawing/2016/5/9/chartex" xmlns:cx4="http://schemas.microsoft.com/office/drawing/2016/5/10/chartex" xmlns:cx5="http://schemas.microsoft.com/office/drawing/2016/5/11/chartex" xmlns:cx6="http://schemas.microsoft.com/office/drawing/2016/5/12/chartex" xmlns:cx7="http://schemas.microsoft.com/office/drawing/2016/5/13/chartex" xmlns:cx8="http://schemas.microsoft.com/office/drawing/2016/5/14/chartex" xmlns:mc="http://schemas.openxmlformats.org/markup-compatibility/2006" xmlns:aink="http://schemas.microsoft.com/office/drawing/2016/ink" xmlns:am3d="http://schemas.microsoft.com/office/drawing/2017/model3d" xmlns:o="urn:schemas-microsoft-com:office:office" xmlns:oel="http://schemas.microsoft.com/office/2019/extlst" xmlns:r="http://schemas.openxmlformats.org/officeDocument/2006/relationships" xmlns:m="http://schemas.openxmlformats.org/officeDocument/2006/math" xmlns:v="urn:schemas-microsoft-com:vml" xmlns:wp14="http://schemas.microsoft.com/office/word/2010/wordprocessingDrawing" xmlns:wp="http://schemas.openxmlformats.org/drawingml/2006/wordprocessingDrawing" xmlns:w10="urn:schemas-microsoft-com:office:word" xmlns:w="http://schemas.openxmlformats.org/wordprocessingml/2006/main" xmlns:w14="http://schemas.microsoft.com/office/word/2010/wordml" xmlns:w15="http://schemas.microsoft.com/office/word/2012/wordml" xmlns:w16cex="http://schemas.microsoft.com/office/word/2018/wordml/cex" xmlns:w16cid="http://schemas.microsoft.com/office/word/2016/wordml/cid" xmlns:w16="http://schemas.microsoft.com/office/word/2018/wordml" xmlns:w16du="http://schemas.microsoft.com/office/word/2023/wordml/word16du" xmlns:w16sdtdh="http://schemas.microsoft.com/office/word/2020/wordml/sdtdatahash" xmlns:w16sdtfl="http://schemas.microsoft.com/office/word/2024/wordml/sdtformatlock" xmlns:w16se="http://schemas.microsoft.com/office/word/2015/wordml/symex" xmlns:wpg="http://schemas.microsoft.com/office/word/2010/wordprocessingGroup" xmlns:wpi="http://schemas.microsoft.com/office/word/2010/wordprocessingInk" xmlns:wne="http://schemas.microsoft.com/office/word/2006/wordml" xmlns:wps="http://schemas.microsoft.com/office/word/2010/wordprocessingShape" mc:Ignorable="w14 w15 w16se w16cid w16 w16cex w16sdtdh w16sdtfl w16du wp14">
   <w:abstractNum w:abstractNumId="0" w15:restartNumberingAfterBreak="0">
+    <w:nsid w:val="24841227"/>
+    <w:multiLevelType w:val="multilevel"/>
+    <w:tmpl w:val="05609608"/>
+    <w:lvl w:ilvl="0">
+      <w:start w:val="1"/>
+      <w:numFmt w:val="decimal"/>
+      <w:lvlText w:val="%1."/>
+      <w:lvlJc w:val="left"/>
+      <w:pPr>
+        <w:tabs>
+          <w:tab w:val="num" w:pos="720"/>
+        </w:tabs>
+        <w:ind w:left="720" w:hanging="360"/>
+      </w:pPr>
+    </w:lvl>
+    <w:lvl w:ilvl="1" w:tentative="1">
+      <w:start w:val="1"/>
+      <w:numFmt w:val="decimal"/>
+      <w:lvlText w:val="%2."/>
+      <w:lvlJc w:val="left"/>
+      <w:pPr>
+        <w:tabs>
+          <w:tab w:val="num" w:pos="1440"/>
+        </w:tabs>
+        <w:ind w:left="1440" w:hanging="360"/>
+      </w:pPr>
+    </w:lvl>
+    <w:lvl w:ilvl="2" w:tentative="1">
+      <w:start w:val="1"/>
+      <w:numFmt w:val="decimal"/>
+      <w:lvlText w:val="%3."/>
+      <w:lvlJc w:val="left"/>
+      <w:pPr>
+        <w:tabs>
+          <w:tab w:val="num" w:pos="2160"/>
+        </w:tabs>
+        <w:ind w:left="2160" w:hanging="360"/>
+      </w:pPr>
+    </w:lvl>
+    <w:lvl w:ilvl="3" w:tentative="1">
+      <w:start w:val="1"/>
+      <w:numFmt w:val="decimal"/>
+      <w:lvlText w:val="%4."/>
+      <w:lvlJc w:val="left"/>
+      <w:pPr>
+        <w:tabs>
+          <w:tab w:val="num" w:pos="2880"/>
+        </w:tabs>
+        <w:ind w:left="2880" w:hanging="360"/>
+      </w:pPr>
+    </w:lvl>
+    <w:lvl w:ilvl="4" w:tentative="1">
+      <w:start w:val="1"/>
+      <w:numFmt w:val="decimal"/>
+      <w:lvlText w:val="%5."/>
+      <w:lvlJc w:val="left"/>
+      <w:pPr>
+        <w:tabs>
+          <w:tab w:val="num" w:pos="3600"/>
+        </w:tabs>
+        <w:ind w:left="3600" w:hanging="360"/>
+      </w:pPr>
+    </w:lvl>
+    <w:lvl w:ilvl="5" w:tentative="1">
+      <w:start w:val="1"/>
+      <w:numFmt w:val="decimal"/>
+      <w:lvlText w:val="%6."/>
+      <w:lvlJc w:val="left"/>
+      <w:pPr>
+        <w:tabs>
+          <w:tab w:val="num" w:pos="4320"/>
+        </w:tabs>
+        <w:ind w:left="4320" w:hanging="360"/>
+      </w:pPr>
+    </w:lvl>
+    <w:lvl w:ilvl="6" w:tentative="1">
+      <w:start w:val="1"/>
+      <w:numFmt w:val="decimal"/>
+      <w:lvlText w:val="%7."/>
+      <w:lvlJc w:val="left"/>
+      <w:pPr>
+        <w:tabs>
+          <w:tab w:val="num" w:pos="5040"/>
+        </w:tabs>
+        <w:ind w:left="5040" w:hanging="360"/>
+      </w:pPr>
+    </w:lvl>
+    <w:lvl w:ilvl="7" w:tentative="1">
+      <w:start w:val="1"/>
+      <w:numFmt w:val="decimal"/>
+      <w:lvlText w:val="%8."/>
+      <w:lvlJc w:val="left"/>
+      <w:pPr>
+        <w:tabs>
+          <w:tab w:val="num" w:pos="5760"/>
+        </w:tabs>
+        <w:ind w:left="5760" w:hanging="360"/>
+      </w:pPr>
+    </w:lvl>
+    <w:lvl w:ilvl="8" w:tentative="1">
+      <w:start w:val="1"/>
+      <w:numFmt w:val="decimal"/>
+      <w:lvlText w:val="%9."/>
+      <w:lvlJc w:val="left"/>
+      <w:pPr>
+        <w:tabs>
+          <w:tab w:val="num" w:pos="6480"/>
+        </w:tabs>
+        <w:ind w:left="6480" w:hanging="360"/>
+      </w:pPr>
+    </w:lvl>
+  </w:abstractNum>
+  <w:abstractNum w:abstractNumId="1" w15:restartNumberingAfterBreak="0">
+    <w:nsid w:val="2F54745F"/>
+    <w:multiLevelType w:val="multilevel"/>
+    <w:tmpl w:val="56EAA9BA"/>
+    <w:lvl w:ilvl="0">
+      <w:start w:val="1"/>
+      <w:numFmt w:val="bullet"/>
+      <w:lvlText w:val=""/>
+      <w:lvlJc w:val="left"/>
+      <w:pPr>
+        <w:tabs>
+          <w:tab w:val="num" w:pos="1800"/>
+        </w:tabs>
+        <w:ind w:left="1800" w:hanging="360"/>
+      </w:pPr>
+      <w:rPr>
+        <w:rFonts w:ascii="Symbol" w:hAnsi="Symbol" w:hint="default"/>
+        <w:sz w:val="20"/>
+      </w:rPr>
+    </w:lvl>
+    <w:lvl w:ilvl="1" w:tentative="1">
+      <w:start w:val="1"/>
+      <w:numFmt w:val="bullet"/>
+      <w:lvlText w:val="o"/>
+      <w:lvlJc w:val="left"/>
+      <w:pPr>
+        <w:tabs>
+          <w:tab w:val="num" w:pos="2520"/>
+        </w:tabs>
+        <w:ind w:left="2520" w:hanging="360"/>
+      </w:pPr>
+      <w:rPr>
+        <w:rFonts w:ascii="Courier New" w:hAnsi="Courier New" w:hint="default"/>
+        <w:sz w:val="20"/>
+      </w:rPr>
+    </w:lvl>
+    <w:lvl w:ilvl="2" w:tentative="1">
+      <w:start w:val="1"/>
+      <w:numFmt w:val="bullet"/>
+      <w:lvlText w:val=""/>
+      <w:lvlJc w:val="left"/>
+      <w:pPr>
+        <w:tabs>
+          <w:tab w:val="num" w:pos="3240"/>
+        </w:tabs>
+        <w:ind w:left="3240" w:hanging="360"/>
+      </w:pPr>
+      <w:rPr>
+        <w:rFonts w:ascii="Wingdings" w:hAnsi="Wingdings" w:hint="default"/>
+        <w:sz w:val="20"/>
+      </w:rPr>
+    </w:lvl>
+    <w:lvl w:ilvl="3" w:tentative="1">
+      <w:start w:val="1"/>
+      <w:numFmt w:val="bullet"/>
+      <w:lvlText w:val=""/>
+      <w:lvlJc w:val="left"/>
+      <w:pPr>
+        <w:tabs>
+          <w:tab w:val="num" w:pos="3960"/>
+        </w:tabs>
+        <w:ind w:left="3960" w:hanging="360"/>
+      </w:pPr>
+      <w:rPr>
+        <w:rFonts w:ascii="Wingdings" w:hAnsi="Wingdings" w:hint="default"/>
+        <w:sz w:val="20"/>
+      </w:rPr>
+    </w:lvl>
+    <w:lvl w:ilvl="4" w:tentative="1">
+      <w:start w:val="1"/>
+      <w:numFmt w:val="bullet"/>
+      <w:lvlText w:val=""/>
+      <w:lvlJc w:val="left"/>
+      <w:pPr>
+        <w:tabs>
+          <w:tab w:val="num" w:pos="4680"/>
+        </w:tabs>
+        <w:ind w:left="4680" w:hanging="360"/>
+      </w:pPr>
+      <w:rPr>
+        <w:rFonts w:ascii="Wingdings" w:hAnsi="Wingdings" w:hint="default"/>
+        <w:sz w:val="20"/>
+      </w:rPr>
+    </w:lvl>
+    <w:lvl w:ilvl="5" w:tentative="1">
+      <w:start w:val="1"/>
+      <w:numFmt w:val="bullet"/>
+      <w:lvlText w:val=""/>
+      <w:lvlJc w:val="left"/>
+      <w:pPr>
+        <w:tabs>
+          <w:tab w:val="num" w:pos="5400"/>
+        </w:tabs>
+        <w:ind w:left="5400" w:hanging="360"/>
+      </w:pPr>
+      <w:rPr>
+        <w:rFonts w:ascii="Wingdings" w:hAnsi="Wingdings" w:hint="default"/>
+        <w:sz w:val="20"/>
+      </w:rPr>
+    </w:lvl>
+    <w:lvl w:ilvl="6" w:tentative="1">
+      <w:start w:val="1"/>
+      <w:numFmt w:val="bullet"/>
+      <w:lvlText w:val=""/>
+      <w:lvlJc w:val="left"/>
+      <w:pPr>
+        <w:tabs>
+          <w:tab w:val="num" w:pos="6120"/>
+        </w:tabs>
+        <w:ind w:left="6120" w:hanging="360"/>
+      </w:pPr>
+      <w:rPr>
+        <w:rFonts w:ascii="Wingdings" w:hAnsi="Wingdings" w:hint="default"/>
+        <w:sz w:val="20"/>
+      </w:rPr>
+    </w:lvl>
+    <w:lvl w:ilvl="7" w:tentative="1">
+      <w:start w:val="1"/>
+      <w:numFmt w:val="bullet"/>
+      <w:lvlText w:val=""/>
+      <w:lvlJc w:val="left"/>
+      <w:pPr>
+        <w:tabs>
+          <w:tab w:val="num" w:pos="6840"/>
+        </w:tabs>
+        <w:ind w:left="6840" w:hanging="360"/>
+      </w:pPr>
+      <w:rPr>
+        <w:rFonts w:ascii="Wingdings" w:hAnsi="Wingdings" w:hint="default"/>
+        <w:sz w:val="20"/>
+      </w:rPr>
+    </w:lvl>
+    <w:lvl w:ilvl="8" w:tentative="1">
+      <w:start w:val="1"/>
+      <w:numFmt w:val="bullet"/>
+      <w:lvlText w:val=""/>
+      <w:lvlJc w:val="left"/>
+      <w:pPr>
+        <w:tabs>
+          <w:tab w:val="num" w:pos="7560"/>
+        </w:tabs>
+        <w:ind w:left="7560" w:hanging="360"/>
+      </w:pPr>
+      <w:rPr>
+        <w:rFonts w:ascii="Wingdings" w:hAnsi="Wingdings" w:hint="default"/>
+        <w:sz w:val="20"/>
+      </w:rPr>
+    </w:lvl>
+  </w:abstractNum>
+  <w:abstractNum w:abstractNumId="2" w15:restartNumberingAfterBreak="0">
     <w:nsid w:val="4478673C"/>
     <w:multiLevelType w:val="hybridMultilevel"/>
     <w:tmpl w:val="55ECBB48"/>
@@ -731,7 +1620,7 @@
       </w:rPr>
     </w:lvl>
   </w:abstractNum>
-  <w:abstractNum w:abstractNumId="1" w15:restartNumberingAfterBreak="0">
+  <w:abstractNum w:abstractNumId="3" w15:restartNumberingAfterBreak="0">
     <w:nsid w:val="52C231AD"/>
     <w:multiLevelType w:val="hybridMultilevel"/>
     <w:tmpl w:val="ECB46D40"/>
@@ -844,11 +1733,321 @@
       </w:rPr>
     </w:lvl>
   </w:abstractNum>
+  <w:abstractNum w:abstractNumId="4" w15:restartNumberingAfterBreak="0">
+    <w:nsid w:val="77374F21"/>
+    <w:multiLevelType w:val="multilevel"/>
+    <w:tmpl w:val="F18622CE"/>
+    <w:lvl w:ilvl="0">
+      <w:start w:val="1"/>
+      <w:numFmt w:val="bullet"/>
+      <w:lvlText w:val=""/>
+      <w:lvlJc w:val="left"/>
+      <w:pPr>
+        <w:tabs>
+          <w:tab w:val="num" w:pos="720"/>
+        </w:tabs>
+        <w:ind w:left="720" w:hanging="360"/>
+      </w:pPr>
+      <w:rPr>
+        <w:rFonts w:ascii="Symbol" w:hAnsi="Symbol" w:hint="default"/>
+        <w:sz w:val="20"/>
+      </w:rPr>
+    </w:lvl>
+    <w:lvl w:ilvl="1" w:tentative="1">
+      <w:start w:val="1"/>
+      <w:numFmt w:val="bullet"/>
+      <w:lvlText w:val="o"/>
+      <w:lvlJc w:val="left"/>
+      <w:pPr>
+        <w:tabs>
+          <w:tab w:val="num" w:pos="1440"/>
+        </w:tabs>
+        <w:ind w:left="1440" w:hanging="360"/>
+      </w:pPr>
+      <w:rPr>
+        <w:rFonts w:ascii="Courier New" w:hAnsi="Courier New" w:hint="default"/>
+        <w:sz w:val="20"/>
+      </w:rPr>
+    </w:lvl>
+    <w:lvl w:ilvl="2" w:tentative="1">
+      <w:start w:val="1"/>
+      <w:numFmt w:val="bullet"/>
+      <w:lvlText w:val=""/>
+      <w:lvlJc w:val="left"/>
+      <w:pPr>
+        <w:tabs>
+          <w:tab w:val="num" w:pos="2160"/>
+        </w:tabs>
+        <w:ind w:left="2160" w:hanging="360"/>
+      </w:pPr>
+      <w:rPr>
+        <w:rFonts w:ascii="Wingdings" w:hAnsi="Wingdings" w:hint="default"/>
+        <w:sz w:val="20"/>
+      </w:rPr>
+    </w:lvl>
+    <w:lvl w:ilvl="3" w:tentative="1">
+      <w:start w:val="1"/>
+      <w:numFmt w:val="bullet"/>
+      <w:lvlText w:val=""/>
+      <w:lvlJc w:val="left"/>
+      <w:pPr>
+        <w:tabs>
+          <w:tab w:val="num" w:pos="2880"/>
+        </w:tabs>
+        <w:ind w:left="2880" w:hanging="360"/>
+      </w:pPr>
+      <w:rPr>
+        <w:rFonts w:ascii="Wingdings" w:hAnsi="Wingdings" w:hint="default"/>
+        <w:sz w:val="20"/>
+      </w:rPr>
+    </w:lvl>
+    <w:lvl w:ilvl="4" w:tentative="1">
+      <w:start w:val="1"/>
+      <w:numFmt w:val="bullet"/>
+      <w:lvlText w:val=""/>
+      <w:lvlJc w:val="left"/>
+      <w:pPr>
+        <w:tabs>
+          <w:tab w:val="num" w:pos="3600"/>
+        </w:tabs>
+        <w:ind w:left="3600" w:hanging="360"/>
+      </w:pPr>
+      <w:rPr>
+        <w:rFonts w:ascii="Wingdings" w:hAnsi="Wingdings" w:hint="default"/>
+        <w:sz w:val="20"/>
+      </w:rPr>
+    </w:lvl>
+    <w:lvl w:ilvl="5" w:tentative="1">
+      <w:start w:val="1"/>
+      <w:numFmt w:val="bullet"/>
+      <w:lvlText w:val=""/>
+      <w:lvlJc w:val="left"/>
+      <w:pPr>
+        <w:tabs>
+          <w:tab w:val="num" w:pos="4320"/>
+        </w:tabs>
+        <w:ind w:left="4320" w:hanging="360"/>
+      </w:pPr>
+      <w:rPr>
+        <w:rFonts w:ascii="Wingdings" w:hAnsi="Wingdings" w:hint="default"/>
+        <w:sz w:val="20"/>
+      </w:rPr>
+    </w:lvl>
+    <w:lvl w:ilvl="6" w:tentative="1">
+      <w:start w:val="1"/>
+      <w:numFmt w:val="bullet"/>
+      <w:lvlText w:val=""/>
+      <w:lvlJc w:val="left"/>
+      <w:pPr>
+        <w:tabs>
+          <w:tab w:val="num" w:pos="5040"/>
+        </w:tabs>
+        <w:ind w:left="5040" w:hanging="360"/>
+      </w:pPr>
+      <w:rPr>
+        <w:rFonts w:ascii="Wingdings" w:hAnsi="Wingdings" w:hint="default"/>
+        <w:sz w:val="20"/>
+      </w:rPr>
+    </w:lvl>
+    <w:lvl w:ilvl="7" w:tentative="1">
+      <w:start w:val="1"/>
+      <w:numFmt w:val="bullet"/>
+      <w:lvlText w:val=""/>
+      <w:lvlJc w:val="left"/>
+      <w:pPr>
+        <w:tabs>
+          <w:tab w:val="num" w:pos="5760"/>
+        </w:tabs>
+        <w:ind w:left="5760" w:hanging="360"/>
+      </w:pPr>
+      <w:rPr>
+        <w:rFonts w:ascii="Wingdings" w:hAnsi="Wingdings" w:hint="default"/>
+        <w:sz w:val="20"/>
+      </w:rPr>
+    </w:lvl>
+    <w:lvl w:ilvl="8" w:tentative="1">
+      <w:start w:val="1"/>
+      <w:numFmt w:val="bullet"/>
+      <w:lvlText w:val=""/>
+      <w:lvlJc w:val="left"/>
+      <w:pPr>
+        <w:tabs>
+          <w:tab w:val="num" w:pos="6480"/>
+        </w:tabs>
+        <w:ind w:left="6480" w:hanging="360"/>
+      </w:pPr>
+      <w:rPr>
+        <w:rFonts w:ascii="Wingdings" w:hAnsi="Wingdings" w:hint="default"/>
+        <w:sz w:val="20"/>
+      </w:rPr>
+    </w:lvl>
+  </w:abstractNum>
+  <w:abstractNum w:abstractNumId="5" w15:restartNumberingAfterBreak="0">
+    <w:nsid w:val="7AE0429F"/>
+    <w:multiLevelType w:val="multilevel"/>
+    <w:tmpl w:val="0D20FBCE"/>
+    <w:lvl w:ilvl="0">
+      <w:start w:val="1"/>
+      <w:numFmt w:val="bullet"/>
+      <w:lvlText w:val=""/>
+      <w:lvlJc w:val="left"/>
+      <w:pPr>
+        <w:tabs>
+          <w:tab w:val="num" w:pos="720"/>
+        </w:tabs>
+        <w:ind w:left="720" w:hanging="360"/>
+      </w:pPr>
+      <w:rPr>
+        <w:rFonts w:ascii="Symbol" w:hAnsi="Symbol" w:hint="default"/>
+        <w:sz w:val="20"/>
+      </w:rPr>
+    </w:lvl>
+    <w:lvl w:ilvl="1" w:tentative="1">
+      <w:start w:val="1"/>
+      <w:numFmt w:val="bullet"/>
+      <w:lvlText w:val="o"/>
+      <w:lvlJc w:val="left"/>
+      <w:pPr>
+        <w:tabs>
+          <w:tab w:val="num" w:pos="1440"/>
+        </w:tabs>
+        <w:ind w:left="1440" w:hanging="360"/>
+      </w:pPr>
+      <w:rPr>
+        <w:rFonts w:ascii="Courier New" w:hAnsi="Courier New" w:hint="default"/>
+        <w:sz w:val="20"/>
+      </w:rPr>
+    </w:lvl>
+    <w:lvl w:ilvl="2" w:tentative="1">
+      <w:start w:val="1"/>
+      <w:numFmt w:val="bullet"/>
+      <w:lvlText w:val=""/>
+      <w:lvlJc w:val="left"/>
+      <w:pPr>
+        <w:tabs>
+          <w:tab w:val="num" w:pos="2160"/>
+        </w:tabs>
+        <w:ind w:left="2160" w:hanging="360"/>
+      </w:pPr>
+      <w:rPr>
+        <w:rFonts w:ascii="Wingdings" w:hAnsi="Wingdings" w:hint="default"/>
+        <w:sz w:val="20"/>
+      </w:rPr>
+    </w:lvl>
+    <w:lvl w:ilvl="3" w:tentative="1">
+      <w:start w:val="1"/>
+      <w:numFmt w:val="bullet"/>
+      <w:lvlText w:val=""/>
+      <w:lvlJc w:val="left"/>
+      <w:pPr>
+        <w:tabs>
+          <w:tab w:val="num" w:pos="2880"/>
+        </w:tabs>
+        <w:ind w:left="2880" w:hanging="360"/>
+      </w:pPr>
+      <w:rPr>
+        <w:rFonts w:ascii="Wingdings" w:hAnsi="Wingdings" w:hint="default"/>
+        <w:sz w:val="20"/>
+      </w:rPr>
+    </w:lvl>
+    <w:lvl w:ilvl="4" w:tentative="1">
+      <w:start w:val="1"/>
+      <w:numFmt w:val="bullet"/>
+      <w:lvlText w:val=""/>
+      <w:lvlJc w:val="left"/>
+      <w:pPr>
+        <w:tabs>
+          <w:tab w:val="num" w:pos="3600"/>
+        </w:tabs>
+        <w:ind w:left="3600" w:hanging="360"/>
+      </w:pPr>
+      <w:rPr>
+        <w:rFonts w:ascii="Wingdings" w:hAnsi="Wingdings" w:hint="default"/>
+        <w:sz w:val="20"/>
+      </w:rPr>
+    </w:lvl>
+    <w:lvl w:ilvl="5" w:tentative="1">
+      <w:start w:val="1"/>
+      <w:numFmt w:val="bullet"/>
+      <w:lvlText w:val=""/>
+      <w:lvlJc w:val="left"/>
+      <w:pPr>
+        <w:tabs>
+          <w:tab w:val="num" w:pos="4320"/>
+        </w:tabs>
+        <w:ind w:left="4320" w:hanging="360"/>
+      </w:pPr>
+      <w:rPr>
+        <w:rFonts w:ascii="Wingdings" w:hAnsi="Wingdings" w:hint="default"/>
+        <w:sz w:val="20"/>
+      </w:rPr>
+    </w:lvl>
+    <w:lvl w:ilvl="6" w:tentative="1">
+      <w:start w:val="1"/>
+      <w:numFmt w:val="bullet"/>
+      <w:lvlText w:val=""/>
+      <w:lvlJc w:val="left"/>
+      <w:pPr>
+        <w:tabs>
+          <w:tab w:val="num" w:pos="5040"/>
+        </w:tabs>
+        <w:ind w:left="5040" w:hanging="360"/>
+      </w:pPr>
+      <w:rPr>
+        <w:rFonts w:ascii="Wingdings" w:hAnsi="Wingdings" w:hint="default"/>
+        <w:sz w:val="20"/>
+      </w:rPr>
+    </w:lvl>
+    <w:lvl w:ilvl="7" w:tentative="1">
+      <w:start w:val="1"/>
+      <w:numFmt w:val="bullet"/>
+      <w:lvlText w:val=""/>
+      <w:lvlJc w:val="left"/>
+      <w:pPr>
+        <w:tabs>
+          <w:tab w:val="num" w:pos="5760"/>
+        </w:tabs>
+        <w:ind w:left="5760" w:hanging="360"/>
+      </w:pPr>
+      <w:rPr>
+        <w:rFonts w:ascii="Wingdings" w:hAnsi="Wingdings" w:hint="default"/>
+        <w:sz w:val="20"/>
+      </w:rPr>
+    </w:lvl>
+    <w:lvl w:ilvl="8" w:tentative="1">
+      <w:start w:val="1"/>
+      <w:numFmt w:val="bullet"/>
+      <w:lvlText w:val=""/>
+      <w:lvlJc w:val="left"/>
+      <w:pPr>
+        <w:tabs>
+          <w:tab w:val="num" w:pos="6480"/>
+        </w:tabs>
+        <w:ind w:left="6480" w:hanging="360"/>
+      </w:pPr>
+      <w:rPr>
+        <w:rFonts w:ascii="Wingdings" w:hAnsi="Wingdings" w:hint="default"/>
+        <w:sz w:val="20"/>
+      </w:rPr>
+    </w:lvl>
+  </w:abstractNum>
   <w:num w:numId="1" w16cid:durableId="2000424628">
-    <w:abstractNumId w:val="0"/>
+    <w:abstractNumId w:val="2"/>
   </w:num>
   <w:num w:numId="2" w16cid:durableId="1108961342">
+    <w:abstractNumId w:val="3"/>
+  </w:num>
+  <w:num w:numId="3" w16cid:durableId="1502352701">
     <w:abstractNumId w:val="1"/>
+  </w:num>
+  <w:num w:numId="4" w16cid:durableId="1514883603">
+    <w:abstractNumId w:val="5"/>
+  </w:num>
+  <w:num w:numId="5" w16cid:durableId="1411389778">
+    <w:abstractNumId w:val="4"/>
+  </w:num>
+  <w:num w:numId="6" w16cid:durableId="580800934">
+    <w:abstractNumId w:val="0"/>
   </w:num>
 </w:numbering>
 </file>
@@ -1281,7 +2480,6 @@
     <w:next w:val="Normal"/>
     <w:link w:val="Heading2Char"/>
     <w:uiPriority w:val="9"/>
-    <w:semiHidden/>
     <w:unhideWhenUsed/>
     <w:qFormat/>
     <w:rsid w:val="008E6FB0"/>
@@ -1304,7 +2502,6 @@
     <w:next w:val="Normal"/>
     <w:link w:val="Heading3Char"/>
     <w:uiPriority w:val="9"/>
-    <w:semiHidden/>
     <w:unhideWhenUsed/>
     <w:qFormat/>
     <w:rsid w:val="008E6FB0"/>
@@ -1456,6 +2653,7 @@
   <w:style w:type="character" w:default="1" w:styleId="DefaultParagraphFont">
     <w:name w:val="Default Paragraph Font"/>
     <w:uiPriority w:val="1"/>
+    <w:semiHidden/>
     <w:unhideWhenUsed/>
   </w:style>
   <w:style w:type="table" w:default="1" w:styleId="TableNormal">
@@ -1497,7 +2695,6 @@
     <w:basedOn w:val="DefaultParagraphFont"/>
     <w:link w:val="Heading2"/>
     <w:uiPriority w:val="9"/>
-    <w:semiHidden/>
     <w:rsid w:val="008E6FB0"/>
     <w:rPr>
       <w:rFonts w:asciiTheme="majorHAnsi" w:eastAsiaTheme="majorEastAsia" w:hAnsiTheme="majorHAnsi" w:cstheme="majorBidi"/>
@@ -1511,7 +2708,6 @@
     <w:basedOn w:val="DefaultParagraphFont"/>
     <w:link w:val="Heading3"/>
     <w:uiPriority w:val="9"/>
-    <w:semiHidden/>
     <w:rsid w:val="008E6FB0"/>
     <w:rPr>
       <w:rFonts w:eastAsiaTheme="majorEastAsia" w:cstheme="majorBidi"/>
@@ -1791,6 +2987,27 @@
       <w:color w:val="605E5C"/>
       <w:shd w:val="clear" w:color="auto" w:fill="E1DFDD"/>
     </w:rPr>
+  </w:style>
+  <w:style w:type="paragraph" w:styleId="NormalWeb">
+    <w:name w:val="Normal (Web)"/>
+    <w:basedOn w:val="Normal"/>
+    <w:uiPriority w:val="99"/>
+    <w:semiHidden/>
+    <w:unhideWhenUsed/>
+    <w:rsid w:val="005B40A6"/>
+    <w:pPr>
+      <w:spacing w:before="100" w:beforeAutospacing="1" w:after="100" w:afterAutospacing="1" w:line="240" w:lineRule="auto"/>
+    </w:pPr>
+    <w:rPr>
+      <w:rFonts w:ascii="Times New Roman" w:eastAsia="Times New Roman" w:hAnsi="Times New Roman" w:cs="Times New Roman"/>
+      <w:kern w:val="0"/>
+      <w14:ligatures w14:val="none"/>
+    </w:rPr>
+  </w:style>
+  <w:style w:type="character" w:customStyle="1" w:styleId="apple-converted-space">
+    <w:name w:val="apple-converted-space"/>
+    <w:basedOn w:val="DefaultParagraphFont"/>
+    <w:rsid w:val="005B40A6"/>
   </w:style>
 </w:styles>
 </file>

</xml_diff>